<commit_message>
Update: add Forum Press cover logo, update docx and pdf
</commit_message>
<xml_diff>
--- a/consensus_change_standards.docx
+++ b/consensus_change_standards.docx
@@ -302,6 +302,51 @@
           <w:szCs w:val="22"/>
         </w:rPr>
         <w:t xml:space="preserve">theforumpress.com</w:t>
+      </w:r>
+    </w:p>
+    <w:p>
+      <w:pPr>
+        <w:spacing w:after="200"/>
+      </w:pPr>
+      <w:r>
+        <w:drawing>
+          <wp:inline distT="0" distB="0" distL="0" distR="0">
+            <wp:extent cx="762000" cy="762000"/>
+            <wp:effectExtent t="0" r="0" b="0" l="0"/>
+            <wp:docPr id="1" name="" descr="" title=""/>
+            <wp:cNvGraphicFramePr>
+              <a:graphicFrameLocks xmlns:a="http://schemas.openxmlformats.org/drawingml/2006/main" noChangeAspect="1"/>
+            </wp:cNvGraphicFramePr>
+            <a:graphic xmlns:a="http://schemas.openxmlformats.org/drawingml/2006/main">
+              <a:graphicData uri="http://schemas.openxmlformats.org/drawingml/2006/picture">
+                <pic:pic xmlns:pic="http://schemas.openxmlformats.org/drawingml/2006/picture">
+                  <pic:nvPicPr>
+                    <pic:cNvPr id="0" name="" descr=""/>
+                    <pic:cNvPicPr>
+                      <a:picLocks noChangeAspect="1" noChangeArrowheads="1"/>
+                    </pic:cNvPicPr>
+                  </pic:nvPicPr>
+                  <pic:blipFill>
+                    <a:blip r:embed="rId7" cstate="none"/>
+                    <a:srcRect/>
+                    <a:stretch>
+                      <a:fillRect/>
+                    </a:stretch>
+                  </pic:blipFill>
+                  <pic:spPr bwMode="auto">
+                    <a:xfrm>
+                      <a:off x="0" y="0"/>
+                      <a:ext cx="762000" cy="762000"/>
+                    </a:xfrm>
+                    <a:prstGeom prst="rect">
+                      <a:avLst/>
+                    </a:prstGeom>
+                  </pic:spPr>
+                </pic:pic>
+              </a:graphicData>
+            </a:graphic>
+          </wp:inline>
+        </w:drawing>
       </w:r>
     </w:p>
     <w:p>

</xml_diff>

<commit_message>
QC pass: tighten scoring, fix citations, normalize style
- §5.2: BIP-110 score 5/20 → 3/20 (maps cleanly to Q2/Q4/Q5); README updated to match
- §3.4: "approximately five orders of magnitude" → "five to seven orders" (correctly spans the 55-90/95 comparison)
- Abstract: "stable production releases" → "stable Knots releases" (matches §1.2)
- Title page: "California Bar No." → "California State Bar No." (consistent with cover/copyright/footer/disclaimer)
- Disclaimer: "a division of Fulks, Inc." → "a Fulks, Inc. company" (consistent with cover/title/footer)
- References: add BIP-8 entry (cited 3x in body, was missing); annotate BIP-110 entry with "originally proposed as BIP-444"
- §2.4: "Bitcoin-Dev mailing list" → "bitcoin-dev mailing list" (matches §1.2, §3.4)
</commit_message>
<xml_diff>
--- a/consensus_change_standards.docx
+++ b/consensus_change_standards.docx
@@ -89,7 +89,7 @@
           <w:sz w:val="22"/>
           <w:szCs w:val="22"/>
         </w:rPr>
-        <w:t>California Bar No. 343622  ·  Solo Bitcoin Miner  ·  Full Node Operator</w:t>
+        <w:t>California State Bar No. 343622  ·  Solo Bitcoin Miner  ·  Full Node Operator</w:t>
       </w:r>
     </w:p>
     <w:p>
@@ -501,7 +501,7 @@
         <w:rPr>
           <w:color w:val="333333"/>
         </w:rPr>
-        <w:t>This absence of standards has produced predictable results. The block size wars of 2015–2017 consumed years of developer time, fractured the community, and produced a contentious hard fork. The SegWit activation depended on the credible threat of a novel and untested User Activated Soft Fork (UASF) — BIP-148 — to break a deadlock that had persisted for eight months after miner signaling stalled. More recently, BIP-110 — a proposed temporary soft fork to restrict arbitrary data in Bitcoin transactions — was released with a buggy activation client, a dangerously low 55% activation threshold, and no formal review period. Its activation client was made available alongside stable production releases on node management platforms, with no risk disclosure or visual differentiation to indicate that selecting it would alter the node’s consensus behavior.</w:t>
+        <w:t>This absence of standards has produced predictable results. The block size wars of 2015–2017 consumed years of developer time, fractured the community, and produced a contentious hard fork. The SegWit activation depended on the credible threat of a novel and untested User Activated Soft Fork (UASF) — BIP-148 — to break a deadlock that had persisted for eight months after miner signaling stalled. More recently, BIP-110 — a proposed temporary soft fork to restrict arbitrary data in Bitcoin transactions — was released with a buggy activation client, a dangerously low 55% activation threshold, and no formal review period. Its activation client was made available alongside stable Knots releases on node management platforms, with no risk disclosure or visual differentiation to indicate that selecting it would alter the node’s consensus behavior.</w:t>
       </w:r>
     </w:p>
     <w:p>
@@ -975,7 +975,7 @@
         <w:rPr>
           <w:color w:val="333333"/>
         </w:rPr>
-        <w:t>Taproot is the gold standard for Bitcoin consensus change governance. Its design was first floated on the Bitcoin-Dev mailing list in January 2018 and formally specified in BIPs 340, 341, and 342 in 2020; it then underwent years of review, extensive formal analysis of its cryptographic primitives (Schnorr signatures), multiple rounds of community feedback, and a novel activation mechanism (Speedy Trial) that provided a defined three-month signaling window with a built-in timeout. The selection of Speedy Trial over BIP-8 with LOT=true and BIP-8 with LOT=false reflected an extended bitcoin-dev mailing list debate over the appropriate balance between activation speed, miner authority, and economic-node authority.</w:t>
+        <w:t>Taproot is the gold standard for Bitcoin consensus change governance. Its design was first floated on the bitcoin-dev mailing list in January 2018 and formally specified in BIPs 340, 341, and 342 in 2020; it then underwent years of review, extensive formal analysis of its cryptographic primitives (Schnorr signatures), multiple rounds of community feedback, and a novel activation mechanism (Speedy Trial) that provided a defined three-month signaling window with a built-in timeout. The selection of Speedy Trial over BIP-8 with LOT=true and BIP-8 with LOT=false reflected an extended bitcoin-dev mailing list debate over the appropriate balance between activation speed, miner authority, and economic-node authority.</w:t>
       </w:r>
     </w:p>
     <w:p>
@@ -2486,7 +2486,7 @@
         <w:rPr>
           <w:color w:val="333333"/>
         </w:rPr>
-        <w:t>Each such deficit represents an opportunity for a reorganization that orphans transactions previously confirmed on the enforcing chain. Exchanges that require six confirmations before crediting a deposit would, at E = 0.55, see roughly one in three confirmation chains exposed to a reorg event at some point during activation. At E = 0.90 or above, such events are statistically nonexistent over the relevant time horizons. The 55%, 90%, and 95% thresholds are not points on a linear spectrum of safety: they differ by approximately five orders of magnitude in expected reorganization exposure during activation.</w:t>
+        <w:t>Each such deficit represents an opportunity for a reorganization that orphans transactions previously confirmed on the enforcing chain. Exchanges that require six confirmations before crediting a deposit would, at E = 0.55, see roughly one in three confirmation chains exposed to a reorg event at some point during activation. At E = 0.90 or above, such events are statistically nonexistent over the relevant time horizons. The 55%, 90%, and 95% thresholds are not points on a linear spectrum of safety: they differ by five to seven orders of magnitude in expected reorganization exposure during activation.</w:t>
       </w:r>
     </w:p>
     <w:p>
@@ -3428,7 +3428,7 @@
         <w:rPr>
           <w:color w:val="333333"/>
         </w:rPr>
-        <w:t>For reference, BIP-110 would score approximately 5/20 under this framework: credit for having a technical specification, a reference implementation, a defined activation mechanism, and a self-executing sunset clause (though one whose deactivation was not demonstrably tested on testnet), with no credit for adequate review period, code quality, independent review, activation safety, or community process. Taproot would score approximately 18/20: criteria 19 (a chain-split contingency plan in the form proposed here) and 20 (evaluation against this framework) postdate Taproot’s activation and so are scored as not met, while every other criterion was met or exceeded.</w:t>
+        <w:t>For reference, BIP-110 would score approximately 3/20 under this framework: credit for having a technical specification, a defined activation mechanism, and a self-executing sunset clause (though one whose deactivation was not demonstrably tested on testnet); no credit for adequate review period, code quality, independent review, activation safety, or community process. Taproot would score approximately 18/20: criteria 19 (a chain-split contingency plan in the form proposed here) and 20 (evaluation against this framework) postdate Taproot’s activation and so are scored as not met, while every other criterion was met or exceeded.</w:t>
       </w:r>
     </w:p>
     <w:p>
@@ -3742,7 +3742,7 @@
           <w:sz w:val="21"/>
           <w:szCs w:val="21"/>
         </w:rPr>
-        <w:t>BIP-9: Version Bits with Timeout and Delay. Pieter Wuille, Peter Todd, Greg Maxwell, Rusty Russell, 2015. github.com/bitcoin/bips/blob/master/bip-0009.mediawiki</w:t>
+        <w:t>BIP-8: Version Bits with Lock-in by Height. Shaolin Fry, Luke Dashjr, 2017. github.com/bitcoin/bips/blob/master/bip-0008.mediawiki</w:t>
       </w:r>
     </w:p>
     <w:p>
@@ -3756,7 +3756,7 @@
           <w:sz w:val="21"/>
           <w:szCs w:val="21"/>
         </w:rPr>
-        <w:t>BIP-16: Pay to Script Hash. Gavin Andresen, 2012. github.com/bitcoin/bips/blob/master/bip-0016.mediawiki</w:t>
+        <w:t>BIP-9: Version Bits with Timeout and Delay. Pieter Wuille, Peter Todd, Greg Maxwell, Rusty Russell, 2015. github.com/bitcoin/bips/blob/master/bip-0009.mediawiki</w:t>
       </w:r>
     </w:p>
     <w:p>
@@ -3770,7 +3770,7 @@
           <w:sz w:val="21"/>
           <w:szCs w:val="21"/>
         </w:rPr>
-        <w:t>BIP-17: OP_CHECKHASHVERIFY (CHV). Luke Dashjr, 2012. github.com/bitcoin/bips/blob/master/bip-0017.mediawiki</w:t>
+        <w:t>BIP-16: Pay to Script Hash. Gavin Andresen, 2012. github.com/bitcoin/bips/blob/master/bip-0016.mediawiki</w:t>
       </w:r>
     </w:p>
     <w:p>
@@ -3784,7 +3784,7 @@
           <w:sz w:val="21"/>
           <w:szCs w:val="21"/>
         </w:rPr>
-        <w:t>BIP-50: March 2013 Chain Fork Post-Mortem. Gavin Andresen, 2013. github.com/bitcoin/bips/blob/master/bip-0050.mediawiki</w:t>
+        <w:t>BIP-17: OP_CHECKHASHVERIFY (CHV). Luke Dashjr, 2012. github.com/bitcoin/bips/blob/master/bip-0017.mediawiki</w:t>
       </w:r>
     </w:p>
     <w:p>
@@ -3798,7 +3798,7 @@
           <w:sz w:val="21"/>
           <w:szCs w:val="21"/>
         </w:rPr>
-        <w:t>BIP-91: Reduced threshold Segwit MASF. James Hilliard, 2017. github.com/bitcoin/bips/blob/master/bip-0091.mediawiki</w:t>
+        <w:t>BIP-50: March 2013 Chain Fork Post-Mortem. Gavin Andresen, 2013. github.com/bitcoin/bips/blob/master/bip-0050.mediawiki</w:t>
       </w:r>
     </w:p>
     <w:p>
@@ -3812,7 +3812,7 @@
           <w:sz w:val="21"/>
           <w:szCs w:val="21"/>
         </w:rPr>
-        <w:t>BIP-101: Increase Maximum Block Size. Gavin Andresen, 2015. github.com/bitcoin/bips/blob/master/bip-0101.mediawiki</w:t>
+        <w:t>BIP-91: Reduced threshold Segwit MASF. James Hilliard, 2017. github.com/bitcoin/bips/blob/master/bip-0091.mediawiki</w:t>
       </w:r>
     </w:p>
     <w:p>
@@ -3826,7 +3826,7 @@
           <w:sz w:val="21"/>
           <w:szCs w:val="21"/>
         </w:rPr>
-        <w:t>BIP-102: Block Size Increase to 2MB. Jeff Garzik, 2015. github.com/bitcoin/bips/blob/master/bip-0102.mediawiki</w:t>
+        <w:t>BIP-101: Increase Maximum Block Size. Gavin Andresen, 2015. github.com/bitcoin/bips/blob/master/bip-0101.mediawiki</w:t>
       </w:r>
     </w:p>
     <w:p>
@@ -3840,7 +3840,7 @@
           <w:sz w:val="21"/>
           <w:szCs w:val="21"/>
         </w:rPr>
-        <w:t>BIP-110: Reduced Data Temporary Softfork. Dathon Ohm, 2025. github.com/bitcoin/bips/blob/master/bip-0110.mediawiki</w:t>
+        <w:t>BIP-102: Block Size Increase to 2MB. Jeff Garzik, 2015. github.com/bitcoin/bips/blob/master/bip-0102.mediawiki</w:t>
       </w:r>
     </w:p>
     <w:p>
@@ -3854,7 +3854,7 @@
           <w:sz w:val="21"/>
           <w:szCs w:val="21"/>
         </w:rPr>
-        <w:t>BIP-141: Segregated Witness (Consensus Layer). Eric Lombrozo, Johnson Lau, Pieter Wuille, 2015. github.com/bitcoin/bips/blob/master/bip-0141.mediawiki</w:t>
+        <w:t>BIP-110: Reduced Data Temporary Softfork (originally proposed as BIP-444). Dathon Ohm, 2025. github.com/bitcoin/bips/blob/master/bip-0110.mediawiki</w:t>
       </w:r>
     </w:p>
     <w:p>
@@ -3868,7 +3868,7 @@
           <w:sz w:val="21"/>
           <w:szCs w:val="21"/>
         </w:rPr>
-        <w:t>BIP-148: Mandatory Activation of Segwit Deployment. Shaolin Fry, 2017. github.com/bitcoin/bips/blob/master/bip-0148.mediawiki</w:t>
+        <w:t>BIP-141: Segregated Witness (Consensus Layer). Eric Lombrozo, Johnson Lau, Pieter Wuille, 2015. github.com/bitcoin/bips/blob/master/bip-0141.mediawiki</w:t>
       </w:r>
     </w:p>
     <w:p>
@@ -3882,7 +3882,7 @@
           <w:sz w:val="21"/>
           <w:szCs w:val="21"/>
         </w:rPr>
-        <w:t>BIP-340: Schnorr Signatures for secp256k1. Pieter Wuille, Jonas Nick, Tim Ruffing, 2020. github.com/bitcoin/bips/blob/master/bip-0340.mediawiki</w:t>
+        <w:t>BIP-148: Mandatory Activation of Segwit Deployment. Shaolin Fry, 2017. github.com/bitcoin/bips/blob/master/bip-0148.mediawiki</w:t>
       </w:r>
     </w:p>
     <w:p>
@@ -3896,7 +3896,7 @@
           <w:sz w:val="21"/>
           <w:szCs w:val="21"/>
         </w:rPr>
-        <w:t>BIP-341: Taproot: SegWit Version 1 Spending Rules. Pieter Wuille, Jonas Nick, Anthony Towns, 2020. github.com/bitcoin/bips/blob/master/bip-0341.mediawiki</w:t>
+        <w:t>BIP-340: Schnorr Signatures for secp256k1. Pieter Wuille, Jonas Nick, Tim Ruffing, 2020. github.com/bitcoin/bips/blob/master/bip-0340.mediawiki</w:t>
       </w:r>
     </w:p>
     <w:p>
@@ -3910,15 +3910,7 @@
           <w:sz w:val="21"/>
           <w:szCs w:val="21"/>
         </w:rPr>
-        <w:t>BIP-342: Validation of Taproot Scripts. Pieter Wuille, Jonas Nick, Anthony Towns, 2020. github.com/bitcoin/bips/blob/master/bip-0342.mediawiki</w:t>
-      </w:r>
-    </w:p>
-    <w:p>
-      <w:pPr>
-        <w:pStyle w:val="Heading2"/>
-      </w:pPr>
-      <w:r>
-        <w:t>Legal Authorities</w:t>
+        <w:t>BIP-341: Taproot: SegWit Version 1 Spending Rules. Pieter Wuille, Jonas Nick, Anthony Towns, 2020. github.com/bitcoin/bips/blob/master/bip-0341.mediawiki</w:t>
       </w:r>
     </w:p>
     <w:p>
@@ -3932,7 +3924,15 @@
           <w:sz w:val="21"/>
           <w:szCs w:val="21"/>
         </w:rPr>
-        <w:t>Aas v. Superior Court, 24 Cal.4th 627 (2000).</w:t>
+        <w:t>BIP-342: Validation of Taproot Scripts. Pieter Wuille, Jonas Nick, Anthony Towns, 2020. github.com/bitcoin/bips/blob/master/bip-0342.mediawiki</w:t>
+      </w:r>
+    </w:p>
+    <w:p>
+      <w:pPr>
+        <w:pStyle w:val="Heading2"/>
+      </w:pPr>
+      <w:r>
+        <w:t>Legal Authorities</w:t>
       </w:r>
     </w:p>
     <w:p>
@@ -3946,7 +3946,7 @@
           <w:sz w:val="21"/>
           <w:szCs w:val="21"/>
         </w:rPr>
-        <w:t>Biakanja v. Irving, 49 Cal.2d 647 (1958).</w:t>
+        <w:t>Aas v. Superior Court, 24 Cal.4th 627 (2000).</w:t>
       </w:r>
     </w:p>
     <w:p>
@@ -3960,7 +3960,7 @@
           <w:sz w:val="21"/>
           <w:szCs w:val="21"/>
         </w:rPr>
-        <w:t>Della Penna v. Toyota Motor Sales, U.S.A., Inc., 11 Cal.4th 376 (1995).</w:t>
+        <w:t>Biakanja v. Irving, 49 Cal.2d 647 (1958).</w:t>
       </w:r>
     </w:p>
     <w:p>
@@ -3974,7 +3974,7 @@
           <w:sz w:val="21"/>
           <w:szCs w:val="21"/>
         </w:rPr>
-        <w:t>Korea Supply Co. v. Lockheed Martin Corp., 29 Cal.4th 1134 (2003).</w:t>
+        <w:t>Della Penna v. Toyota Motor Sales, U.S.A., Inc., 11 Cal.4th 376 (1995).</w:t>
       </w:r>
     </w:p>
     <w:p>
@@ -3988,7 +3988,7 @@
           <w:sz w:val="21"/>
           <w:szCs w:val="21"/>
         </w:rPr>
-        <w:t>Pacific Gas &amp; Electric Co. v. Bear Stearns &amp; Co., 50 Cal.3d 1118 (1990).</w:t>
+        <w:t>Korea Supply Co. v. Lockheed Martin Corp., 29 Cal.4th 1134 (2003).</w:t>
       </w:r>
     </w:p>
     <w:p>
@@ -4002,7 +4002,7 @@
           <w:sz w:val="21"/>
           <w:szCs w:val="21"/>
         </w:rPr>
-        <w:t>Robinson Helicopter Co. v. Dana Corp., 34 Cal.4th 979 (2004).</w:t>
+        <w:t>Pacific Gas &amp; Electric Co. v. Bear Stearns &amp; Co., 50 Cal.3d 1118 (1990).</w:t>
       </w:r>
     </w:p>
     <w:p>
@@ -4016,7 +4016,7 @@
           <w:sz w:val="21"/>
           <w:szCs w:val="21"/>
         </w:rPr>
-        <w:t>Tulip Trading Ltd v van der Laan [2023] EWCA Civ 83, Court of Appeal of England and Wales (3 February 2023). judiciary.uk/wp-content/uploads/2023/02/Tulip-v-Van-Der-Laan-judgment-030223.pdf</w:t>
+        <w:t>Robinson Helicopter Co. v. Dana Corp., 34 Cal.4th 979 (2004).</w:t>
       </w:r>
     </w:p>
     <w:p>
@@ -4030,7 +4030,7 @@
           <w:sz w:val="21"/>
           <w:szCs w:val="21"/>
         </w:rPr>
-        <w:t>Rev. Rul. 2019-24, 2019-44 I.R.B. 1004 (Oct. 9, 2019) (tax treatment of cryptocurrency hard forks). irs.gov/pub/irs-drop/rr-19-24.pdf</w:t>
+        <w:t>Tulip Trading Ltd v van der Laan [2023] EWCA Civ 83, Court of Appeal of England and Wales (3 February 2023). judiciary.uk/wp-content/uploads/2023/02/Tulip-v-Van-Der-Laan-judgment-030223.pdf</w:t>
       </w:r>
     </w:p>
     <w:p>
@@ -4044,7 +4044,7 @@
           <w:sz w:val="21"/>
           <w:szCs w:val="21"/>
         </w:rPr>
-        <w:t>Restatement (Second) of Torts § 552 (Am. Law Inst. 1977).</w:t>
+        <w:t>Rev. Rul. 2019-24, 2019-44 I.R.B. 1004 (Oct. 9, 2019) (tax treatment of cryptocurrency hard forks). irs.gov/pub/irs-drop/rr-19-24.pdf</w:t>
       </w:r>
     </w:p>
     <w:p>
@@ -4058,15 +4058,7 @@
           <w:sz w:val="21"/>
           <w:szCs w:val="21"/>
         </w:rPr>
-        <w:t>Walch, Angela. “In Code(rs) We Trust: Software Developers as Fiduciaries in Public Blockchains.” In Regulating Blockchain: Techno-Social and Legal Challenges, edited by Philipp Hacker, Ioannis Lianos, Georgios Dimitropoulos &amp; Stefan Eich, 58–81. Oxford: Oxford University Press, 2019.</w:t>
-      </w:r>
-    </w:p>
-    <w:p>
-      <w:pPr>
-        <w:pStyle w:val="Heading2"/>
-      </w:pPr>
-      <w:r>
-        <w:t>Software Releases</w:t>
+        <w:t>Restatement (Second) of Torts § 552 (Am. Law Inst. 1977).</w:t>
       </w:r>
     </w:p>
     <w:p>
@@ -4080,7 +4072,15 @@
           <w:sz w:val="21"/>
           <w:szCs w:val="21"/>
         </w:rPr>
-        <w:t>Bitcoin Core v30.2 Release Notes. Bitcoin Core Project, 10 January 2026. bitcoincore.org/en/releases/30.2/</w:t>
+        <w:t>Walch, Angela. “In Code(rs) We Trust: Software Developers as Fiduciaries in Public Blockchains.” In Regulating Blockchain: Techno-Social and Legal Challenges, edited by Philipp Hacker, Ioannis Lianos, Georgios Dimitropoulos &amp; Stefan Eich, 58–81. Oxford: Oxford University Press, 2019.</w:t>
+      </w:r>
+    </w:p>
+    <w:p>
+      <w:pPr>
+        <w:pStyle w:val="Heading2"/>
+      </w:pPr>
+      <w:r>
+        <w:t>Software Releases</w:t>
       </w:r>
     </w:p>
     <w:p>
@@ -4094,15 +4094,7 @@
           <w:sz w:val="21"/>
           <w:szCs w:val="21"/>
         </w:rPr>
-        <w:t>Bitcoin Knots v29.3.knots20260210. Bitcoin Knots Project, 2026. github.com/bitcoinknots/bitcoin/releases</w:t>
-      </w:r>
-    </w:p>
-    <w:p>
-      <w:pPr>
-        <w:pStyle w:val="Heading2"/>
-      </w:pPr>
-      <w:r>
-        <w:t>License</w:t>
+        <w:t>Bitcoin Core v30.2 Release Notes. Bitcoin Core Project, 10 January 2026. bitcoincore.org/en/releases/30.2/</w:t>
       </w:r>
     </w:p>
     <w:p>
@@ -4116,6 +4108,28 @@
           <w:sz w:val="21"/>
           <w:szCs w:val="21"/>
         </w:rPr>
+        <w:t>Bitcoin Knots v29.3.knots20260210. Bitcoin Knots Project, 2026. github.com/bitcoinknots/bitcoin/releases</w:t>
+      </w:r>
+    </w:p>
+    <w:p>
+      <w:pPr>
+        <w:pStyle w:val="Heading2"/>
+      </w:pPr>
+      <w:r>
+        <w:t>License</w:t>
+      </w:r>
+    </w:p>
+    <w:p>
+      <w:pPr>
+        <w:spacing w:after="160" w:line="288" w:lineRule="auto"/>
+        <w:ind w:left="360" w:hanging="360"/>
+      </w:pPr>
+      <w:r>
+        <w:rPr>
+          <w:color w:val="333333"/>
+          <w:sz w:val="21"/>
+          <w:szCs w:val="21"/>
+        </w:rPr>
         <w:t>Creative Commons Attribution 4.0 International (CC BY 4.0). creativecommons.org/licenses/by/4.0/</w:t>
       </w:r>
     </w:p>
@@ -4153,7 +4167,7 @@
         <w:rPr>
           <w:color w:val="333333"/>
         </w:rPr>
-        <w:t>The author is a practicing attorney licensed in the State of California (State Bar No. 343622) and admitted to the United States District Court for the Central District of California. The views expressed in this document are the author’s own and do not represent the views of any employer, client, or affiliated organization. This document is published by The Forum Press, a division of Fulks, Inc.</w:t>
+        <w:t>The author is a practicing attorney licensed in the State of California (State Bar No. 343622) and admitted to the United States District Court for the Central District of California. The views expressed in this document are the author’s own and do not represent the views of any employer, client, or affiliated organization. This document is published by The Forum Press, a Fulks, Inc. company.</w:t>
       </w:r>
     </w:p>
     <w:p>

</xml_diff>

<commit_message>
Cover redesign: editable SVG source, portrait full-bleed in PDF
- Cover.svg: new editable vector source. All text/lines/shapes are plain
  SVG elements — open in any editor. Portrait 1700×2200 (8.5×11 aspect),
  Merriweather Black title, Roboto sans, Bitcoin-orange accent rule + dot,
  VOL. 01 · 2026 editorial mark, single decorative ring upper-right.
- Cover_ForWeb.png: re-rendered from SVG at 2550px (300 DPI Letter).
  Replaces the previous square version.
- Credentials simplified: dropped "J.D. magna cum laude / B.A. Computer
  Science" line (CV padding on a cover) — bar number + Solo Bitcoin
  Miner / Full Node Operator is the credential that matters here.
- "Revised May 2026" added under edition line, right-aligned in italic.
- docx: cover embedded as page 1 via section break, zero margins for
  section 1 (full bleed). Remaining sections retain 1" margins.
- PDF: re-exported, 33 pages (cover + 32 original).

Re-render command in Cover.svg header comment.
</commit_message>
<xml_diff>
--- a/consensus_change_standards.docx
+++ b/consensus_change_standards.docx
@@ -2,6 +2,57 @@
 <file path=word/document.xml><?xml version="1.0" encoding="utf-8"?>
 <w:document xmlns:wpc="http://schemas.microsoft.com/office/word/2010/wordprocessingCanvas" xmlns:cx="http://schemas.microsoft.com/office/drawing/2014/chartex" xmlns:cx1="http://schemas.microsoft.com/office/drawing/2015/9/8/chartex" xmlns:cx2="http://schemas.microsoft.com/office/drawing/2015/10/21/chartex" xmlns:cx3="http://schemas.microsoft.com/office/drawing/2016/5/9/chartex" xmlns:cx4="http://schemas.microsoft.com/office/drawing/2016/5/10/chartex" xmlns:cx5="http://schemas.microsoft.com/office/drawing/2016/5/11/chartex" xmlns:cx6="http://schemas.microsoft.com/office/drawing/2016/5/12/chartex" xmlns:cx7="http://schemas.microsoft.com/office/drawing/2016/5/13/chartex" xmlns:cx8="http://schemas.microsoft.com/office/drawing/2016/5/14/chartex" xmlns:mc="http://schemas.openxmlformats.org/markup-compatibility/2006" xmlns:aink="http://schemas.microsoft.com/office/drawing/2016/ink" xmlns:am3d="http://schemas.microsoft.com/office/drawing/2017/model3d" xmlns:o="urn:schemas-microsoft-com:office:office" xmlns:oel="http://schemas.microsoft.com/office/2019/extlst" xmlns:r="http://schemas.openxmlformats.org/officeDocument/2006/relationships" xmlns:m="http://schemas.openxmlformats.org/officeDocument/2006/math" xmlns:v="urn:schemas-microsoft-com:vml" xmlns:wp14="http://schemas.microsoft.com/office/word/2010/wordprocessingDrawing" xmlns:wp="http://schemas.openxmlformats.org/drawingml/2006/wordprocessingDrawing" xmlns:w10="urn:schemas-microsoft-com:office:word" xmlns:w="http://schemas.openxmlformats.org/wordprocessingml/2006/main" xmlns:w14="http://schemas.microsoft.com/office/word/2010/wordml" xmlns:w15="http://schemas.microsoft.com/office/word/2012/wordml" xmlns:w16cex="http://schemas.microsoft.com/office/word/2018/wordml/cex" xmlns:w16cid="http://schemas.microsoft.com/office/word/2016/wordml/cid" xmlns:w16="http://schemas.microsoft.com/office/word/2018/wordml" xmlns:w16du="http://schemas.microsoft.com/office/word/2023/wordml/word16du" xmlns:w16sdtdh="http://schemas.microsoft.com/office/word/2020/wordml/sdtdatahash" xmlns:w16sdtfl="http://schemas.microsoft.com/office/word/2024/wordml/sdtformatlock" xmlns:w16se="http://schemas.microsoft.com/office/word/2015/wordml/symex" xmlns:wpg="http://schemas.microsoft.com/office/word/2010/wordprocessingGroup" xmlns:wpi="http://schemas.microsoft.com/office/word/2010/wordprocessingInk" xmlns:wne="http://schemas.microsoft.com/office/word/2006/wordml" xmlns:wps="http://schemas.microsoft.com/office/word/2010/wordprocessingShape" mc:Ignorable="w14 w15 w16se w16cid w16 w16cex w16sdtdh w16sdtfl w16du wp14">
   <w:body>
+    <w:p>
+      <w:pPr>
+        <w:spacing w:before="0" w:after="0" w:line="240" w:lineRule="auto"/>
+        <w:jc w:val="center"/>
+      </w:pPr>
+      <w:r>
+        <w:drawing>
+          <wp:inline xmlns:a="http://schemas.openxmlformats.org/drawingml/2006/main" xmlns:pic="http://schemas.openxmlformats.org/drawingml/2006/picture">
+            <wp:extent cx="7772400" cy="10058400"/>
+            <wp:docPr id="3" name="Picture 3"/>
+            <wp:cNvGraphicFramePr>
+              <a:graphicFrameLocks noChangeAspect="1"/>
+            </wp:cNvGraphicFramePr>
+            <a:graphic>
+              <a:graphicData uri="http://schemas.openxmlformats.org/drawingml/2006/picture">
+                <pic:pic>
+                  <pic:nvPicPr>
+                    <pic:cNvPr id="0" name="Cover_ForWeb.png"/>
+                    <pic:cNvPicPr/>
+                  </pic:nvPicPr>
+                  <pic:blipFill>
+                    <a:blip r:embed="rId8"/>
+                    <a:stretch>
+                      <a:fillRect/>
+                    </a:stretch>
+                  </pic:blipFill>
+                  <pic:spPr>
+                    <a:xfrm>
+                      <a:off x="0" y="0"/>
+                      <a:ext cx="7772400" cy="10058400"/>
+                    </a:xfrm>
+                    <a:prstGeom prst="rect"/>
+                  </pic:spPr>
+                </pic:pic>
+              </a:graphicData>
+            </a:graphic>
+          </wp:inline>
+        </w:drawing>
+      </w:r>
+    </w:p>
+    <w:p>
+      <w:pPr>
+        <w:spacing w:after="0" w:before="0" w:line="240" w:lineRule="auto"/>
+        <w:sectPr>
+          <w:pgSz w:w="12240" w:h="15840"/>
+          <w:pgMar w:top="0" w:right="0" w:bottom="0" w:left="0" w:header="0" w:footer="0" w:gutter="0"/>
+          <w:cols w:space="720"/>
+          <w:docGrid w:linePitch="360"/>
+        </w:sectPr>
+      </w:pPr>
+    </w:p>
     <w:p>
       <w:pPr>
         <w:spacing w:before="3800"/>

</xml_diff>

<commit_message>
Drop redundant cream title page now that cover handles page 1
The pre-redesign cream text title page repeated every piece of info that
now lives on the dark full-bleed cover (title, subtitle, author, bar
number, miner/operator, URL, edition + revision). Removed it, plus the
1.67-inch top-spacer paragraph that originally pushed the copyright
content down to balance with the title page above.

Flow is now:
  Page 1: cover (full-bleed)
  Page 2: copyright + license + disclaimer
  Page 3+: abstract, body, references

Total: 32 pages (was 33; cover replaces title page rather than adding to
it).
</commit_message>
<xml_diff>
--- a/consensus_change_standards.docx
+++ b/consensus_change_standards.docx
@@ -51,184 +51,6 @@
           <w:cols w:space="720"/>
           <w:docGrid w:linePitch="360"/>
         </w:sectPr>
-      </w:pPr>
-    </w:p>
-    <w:p>
-      <w:pPr>
-        <w:spacing w:before="3800"/>
-      </w:pPr>
-      <w:r>
-        <w:rPr>
-          <w:noProof/>
-        </w:rPr>
-        <w:pict w14:anchorId="3AF6AD9E">
-          <v:rect id="cover-tint" o:spid="_x0000_s1027" style="position:absolute;margin-left:0;margin-top:0;width:612pt;height:11in;z-index:-251658752;mso-position-horizontal:left;mso-position-horizontal-relative:page;mso-position-vertical:top;mso-position-vertical-relative:page" fillcolor="#f4f2ec" stroked="f">
-            <w10:wrap anchorx="page" anchory="page"/>
-          </v:rect>
-        </w:pict>
-      </w:r>
-    </w:p>
-    <w:p>
-      <w:pPr>
-        <w:spacing w:after="120"/>
-        <w:jc w:val="center"/>
-      </w:pPr>
-      <w:r>
-        <w:rPr>
-          <w:rFonts w:ascii="Arial" w:eastAsia="Arial" w:hAnsi="Arial" w:cs="Arial"/>
-          <w:b/>
-          <w:bCs/>
-          <w:color w:val="1B2A4A"/>
-          <w:sz w:val="52"/>
-          <w:szCs w:val="52"/>
-        </w:rPr>
-        <w:t>CONSENSUS CHANGE STANDARDS</w:t>
-      </w:r>
-    </w:p>
-    <w:p>
-      <w:pPr>
-        <w:spacing w:after="800"/>
-        <w:jc w:val="center"/>
-      </w:pPr>
-      <w:r>
-        <w:rPr>
-          <w:color w:val="555555"/>
-          <w:sz w:val="32"/>
-          <w:szCs w:val="32"/>
-        </w:rPr>
-        <w:t>A Legal and Technical Framework</w:t>
-      </w:r>
-      <w:r>
-        <w:rPr>
-          <w:color w:val="555555"/>
-          <w:sz w:val="32"/>
-          <w:szCs w:val="32"/>
-        </w:rPr>
-        <w:br/>
-        <w:t>for Bitcoin Protocol Governance</w:t>
-      </w:r>
-    </w:p>
-    <w:p>
-      <w:pPr>
-        <w:pBdr>
-          <w:top w:val="single" w:sz="6" w:space="20" w:color="F7931A"/>
-        </w:pBdr>
-        <w:spacing w:after="120"/>
-        <w:jc w:val="center"/>
-      </w:pPr>
-      <w:r>
-        <w:rPr>
-          <w:rFonts w:ascii="Arial" w:eastAsia="Arial" w:hAnsi="Arial" w:cs="Arial"/>
-          <w:b/>
-          <w:bCs/>
-          <w:color w:val="1B2A4A"/>
-          <w:spacing w:val="80"/>
-          <w:sz w:val="28"/>
-          <w:szCs w:val="28"/>
-        </w:rPr>
-        <w:t>ASAF FULKS</w:t>
-      </w:r>
-    </w:p>
-    <w:p>
-      <w:pPr>
-        <w:spacing w:after="40"/>
-        <w:jc w:val="center"/>
-      </w:pPr>
-      <w:r>
-        <w:rPr>
-          <w:color w:val="555555"/>
-          <w:sz w:val="22"/>
-          <w:szCs w:val="22"/>
-        </w:rPr>
-        <w:t>California State Bar No. 343622  ·  Solo Bitcoin Miner  ·  Full Node Operator</w:t>
-      </w:r>
-    </w:p>
-    <w:p>
-      <w:pPr>
-        <w:spacing w:after="1200"/>
-        <w:jc w:val="center"/>
-      </w:pPr>
-      <w:r>
-        <w:rPr>
-          <w:color w:val="2E75B6"/>
-          <w:sz w:val="22"/>
-          <w:szCs w:val="22"/>
-        </w:rPr>
-        <w:t>asaffulkslaw.com</w:t>
-      </w:r>
-    </w:p>
-    <w:p>
-      <w:pPr>
-        <w:spacing w:after="200"/>
-        <w:jc w:val="center"/>
-      </w:pPr>
-      <w:r>
-        <w:rPr>
-          <w:noProof/>
-        </w:rPr>
-        <w:drawing>
-          <wp:inline distT="0" distB="0" distL="0" distR="0" wp14:anchorId="699CC340" wp14:editId="3DFB5E45">
-            <wp:extent cx="1097280" cy="1097280"/>
-            <wp:effectExtent l="0" t="0" r="0" b="0"/>
-            <wp:docPr id="2" name="Forum Press logo"/>
-            <wp:cNvGraphicFramePr>
-              <a:graphicFrameLocks xmlns:a="http://schemas.openxmlformats.org/drawingml/2006/main" noChangeAspect="1"/>
-            </wp:cNvGraphicFramePr>
-            <a:graphic xmlns:a="http://schemas.openxmlformats.org/drawingml/2006/main">
-              <a:graphicData uri="http://schemas.openxmlformats.org/drawingml/2006/picture">
-                <pic:pic xmlns:pic="http://schemas.openxmlformats.org/drawingml/2006/picture">
-                  <pic:nvPicPr>
-                    <pic:cNvPr id="0" name=""/>
-                    <pic:cNvPicPr>
-                      <a:picLocks noChangeAspect="1" noChangeArrowheads="1"/>
-                    </pic:cNvPicPr>
-                  </pic:nvPicPr>
-                  <pic:blipFill>
-                    <a:blip r:embed="rId5"/>
-                    <a:srcRect/>
-                    <a:stretch>
-                      <a:fillRect/>
-                    </a:stretch>
-                  </pic:blipFill>
-                  <pic:spPr bwMode="auto">
-                    <a:xfrm>
-                      <a:off x="0" y="0"/>
-                      <a:ext cx="1097280" cy="1097280"/>
-                    </a:xfrm>
-                    <a:prstGeom prst="rect">
-                      <a:avLst/>
-                    </a:prstGeom>
-                  </pic:spPr>
-                </pic:pic>
-              </a:graphicData>
-            </a:graphic>
-          </wp:inline>
-        </w:drawing>
-      </w:r>
-    </w:p>
-    <w:p>
-      <w:pPr>
-        <w:jc w:val="center"/>
-      </w:pPr>
-      <w:r>
-        <w:rPr>
-          <w:i/>
-          <w:iCs/>
-          <w:color w:val="888888"/>
-          <w:sz w:val="20"/>
-          <w:szCs w:val="20"/>
-        </w:rPr>
-        <w:t>First Edition  ·  April 2026  ·  Revised May 2026</w:t>
-      </w:r>
-    </w:p>
-    <w:p>
-      <w:r>
-        <w:br w:type="page"/>
-      </w:r>
-    </w:p>
-    <w:p>
-      <w:pPr>
-        <w:spacing w:before="2400"/>
       </w:pPr>
     </w:p>
     <w:p>

</xml_diff>

<commit_message>
Add editorial running header + page numbers; drop redundant page break
Header (body section only): small-caps "Consensus Change Standards" left,
STYLEREF "Heading 1" field right (dynamically shows current section name:
Abstract, Section 1: The Problem, etc.), thin gray rule beneath.
Footer: centered page number, starting at 1 on the abstract page.

Cover (page 1) and copyright/legal page (page 2) are unpaginated per
book convention — sections set with empty headers/footers and
is_linked_to_previous=False.

Also dropped a redundant explicit page break that was creating a blank
verso page between the copyright page and the abstract (the section
break already creates the page boundary). PDF is now 31 pages.
</commit_message>
<xml_diff>
--- a/consensus_change_standards.docx
+++ b/consensus_change_standards.docx
@@ -46,6 +46,8 @@
       <w:pPr>
         <w:spacing w:after="0" w:before="0" w:line="240" w:lineRule="auto"/>
         <w:sectPr>
+          <w:headerReference w:type="default" r:id="rId9"/>
+          <w:footerReference w:type="default" r:id="rId10"/>
           <w:pgSz w:w="12240" w:h="15840"/>
           <w:pgMar w:top="0" w:right="0" w:bottom="0" w:left="0" w:header="0" w:footer="0" w:gutter="0"/>
           <w:cols w:space="720"/>
@@ -332,18 +334,14 @@
     <w:p>
       <w:pPr>
         <w:sectPr>
+          <w:headerReference w:type="default" r:id="rId11"/>
+          <w:footerReference w:type="default" r:id="rId12"/>
           <w:pgSz w:w="12240" w:h="15840"/>
           <w:pgMar w:top="1440" w:right="1440" w:bottom="1440" w:left="1440" w:header="708" w:footer="708" w:gutter="0"/>
           <w:cols w:space="720"/>
           <w:docGrid w:linePitch="360"/>
         </w:sectPr>
       </w:pPr>
-    </w:p>
-    <w:p>
-      <w:r>
-        <w:lastRenderedPageBreak/>
-        <w:br w:type="page"/>
-      </w:r>
     </w:p>
     <w:p>
       <w:pPr>
@@ -4068,6 +4066,8 @@
       </w:r>
     </w:p>
     <w:sectPr>
+      <w:headerReference w:type="default" r:id="rId13"/>
+      <w:footerReference w:type="default" r:id="rId14"/>
       <w:pgSz w:w="12240" w:h="15840"/>
       <w:pgMar w:top="1440" w:right="1440" w:bottom="1440" w:left="1440" w:header="708" w:footer="708" w:gutter="0"/>
       <w:pgNumType w:start="1"/>
@@ -4076,6 +4076,193 @@
     </w:sectPr>
   </w:body>
 </w:document>
+</file>
+
+<file path=word/footer1.xml><?xml version="1.0" encoding="utf-8"?>
+<w:ftr xmlns:m="http://schemas.openxmlformats.org/officeDocument/2006/math" xmlns:mc="http://schemas.openxmlformats.org/markup-compatibility/2006" xmlns:mo="http://schemas.microsoft.com/office/mac/office/2008/main" xmlns:mv="urn:schemas-microsoft-com:mac:vml" xmlns:o="urn:schemas-microsoft-com:office:office" xmlns:r="http://schemas.openxmlformats.org/officeDocument/2006/relationships" xmlns:v="urn:schemas-microsoft-com:vml" xmlns:w10="urn:schemas-microsoft-com:office:word" xmlns:w14="http://schemas.microsoft.com/office/word/2010/wordml" xmlns:w="http://schemas.openxmlformats.org/wordprocessingml/2006/main" xmlns:wne="http://schemas.microsoft.com/office/word/2006/wordml" xmlns:wp14="http://schemas.microsoft.com/office/word/2010/wordprocessingDrawing" xmlns:wp="http://schemas.openxmlformats.org/drawingml/2006/wordprocessingDrawing" xmlns:wpc="http://schemas.microsoft.com/office/word/2010/wordprocessingCanvas" xmlns:wpg="http://schemas.microsoft.com/office/word/2010/wordprocessingGroup" xmlns:wpi="http://schemas.microsoft.com/office/word/2010/wordprocessingInk" xmlns:wps="http://schemas.microsoft.com/office/word/2010/wordprocessingShape" mc:Ignorable="w14 wp14">
+  <w:p>
+    <w:pPr>
+      <w:pStyle w:val="Header"/>
+    </w:pPr>
+  </w:p>
+</w:ftr>
+</file>
+
+<file path=word/footer2.xml><?xml version="1.0" encoding="utf-8"?>
+<w:ftr xmlns:m="http://schemas.openxmlformats.org/officeDocument/2006/math" xmlns:mc="http://schemas.openxmlformats.org/markup-compatibility/2006" xmlns:mo="http://schemas.microsoft.com/office/mac/office/2008/main" xmlns:mv="urn:schemas-microsoft-com:mac:vml" xmlns:o="urn:schemas-microsoft-com:office:office" xmlns:r="http://schemas.openxmlformats.org/officeDocument/2006/relationships" xmlns:v="urn:schemas-microsoft-com:vml" xmlns:w10="urn:schemas-microsoft-com:office:word" xmlns:w14="http://schemas.microsoft.com/office/word/2010/wordml" xmlns:w="http://schemas.openxmlformats.org/wordprocessingml/2006/main" xmlns:wne="http://schemas.microsoft.com/office/word/2006/wordml" xmlns:wp14="http://schemas.microsoft.com/office/word/2010/wordprocessingDrawing" xmlns:wp="http://schemas.openxmlformats.org/drawingml/2006/wordprocessingDrawing" xmlns:wpc="http://schemas.microsoft.com/office/word/2010/wordprocessingCanvas" xmlns:wpg="http://schemas.microsoft.com/office/word/2010/wordprocessingGroup" xmlns:wpi="http://schemas.microsoft.com/office/word/2010/wordprocessingInk" xmlns:wps="http://schemas.microsoft.com/office/word/2010/wordprocessingShape" mc:Ignorable="w14 wp14">
+  <w:p>
+    <w:pPr>
+      <w:pStyle w:val="Header"/>
+    </w:pPr>
+  </w:p>
+</w:ftr>
+</file>
+
+<file path=word/footer3.xml><?xml version="1.0" encoding="utf-8"?>
+<w:ftr xmlns:m="http://schemas.openxmlformats.org/officeDocument/2006/math" xmlns:mc="http://schemas.openxmlformats.org/markup-compatibility/2006" xmlns:mo="http://schemas.microsoft.com/office/mac/office/2008/main" xmlns:mv="urn:schemas-microsoft-com:mac:vml" xmlns:o="urn:schemas-microsoft-com:office:office" xmlns:r="http://schemas.openxmlformats.org/officeDocument/2006/relationships" xmlns:v="urn:schemas-microsoft-com:vml" xmlns:w10="urn:schemas-microsoft-com:office:word" xmlns:w14="http://schemas.microsoft.com/office/word/2010/wordml" xmlns:w="http://schemas.openxmlformats.org/wordprocessingml/2006/main" xmlns:wne="http://schemas.microsoft.com/office/word/2006/wordml" xmlns:wp14="http://schemas.microsoft.com/office/word/2010/wordprocessingDrawing" xmlns:wp="http://schemas.openxmlformats.org/drawingml/2006/wordprocessingDrawing" xmlns:wpc="http://schemas.microsoft.com/office/word/2010/wordprocessingCanvas" xmlns:wpg="http://schemas.microsoft.com/office/word/2010/wordprocessingGroup" xmlns:wpi="http://schemas.microsoft.com/office/word/2010/wordprocessingInk" xmlns:wps="http://schemas.microsoft.com/office/word/2010/wordprocessingShape" mc:Ignorable="w14 wp14">
+  <w:p>
+    <w:pPr>
+      <w:pStyle w:val="Footer"/>
+      <w:jc w:val="center"/>
+      <w:spacing w:before="0"/>
+      <w:rPr>
+        <w:rFonts w:ascii="Calibri" w:hAnsi="Calibri"/>
+        <w:sz w:val="18"/>
+        <w:color w:val="6E7681"/>
+      </w:rPr>
+    </w:pPr>
+    <w:r>
+      <w:rPr>
+        <w:rFonts w:ascii="Calibri" w:hAnsi="Calibri"/>
+        <w:sz w:val="18"/>
+        <w:color w:val="6E7681"/>
+      </w:rPr>
+      <w:fldChar w:fldCharType="begin"/>
+    </w:r>
+    <w:r>
+      <w:rPr>
+        <w:rFonts w:ascii="Calibri" w:hAnsi="Calibri"/>
+        <w:sz w:val="18"/>
+        <w:color w:val="6E7681"/>
+      </w:rPr>
+      <w:instrText xml:space="preserve"> PAGE </w:instrText>
+    </w:r>
+    <w:r>
+      <w:rPr>
+        <w:rFonts w:ascii="Calibri" w:hAnsi="Calibri"/>
+        <w:sz w:val="18"/>
+        <w:color w:val="6E7681"/>
+      </w:rPr>
+      <w:fldChar w:fldCharType="separate"/>
+    </w:r>
+    <w:r>
+      <w:rPr>
+        <w:rFonts w:ascii="Calibri" w:hAnsi="Calibri"/>
+        <w:sz w:val="18"/>
+        <w:color w:val="6E7681"/>
+      </w:rPr>
+      <w:t>3</w:t>
+    </w:r>
+    <w:r>
+      <w:rPr>
+        <w:rFonts w:ascii="Calibri" w:hAnsi="Calibri"/>
+        <w:sz w:val="18"/>
+        <w:color w:val="6E7681"/>
+      </w:rPr>
+      <w:fldChar w:fldCharType="end"/>
+    </w:r>
+  </w:p>
+</w:ftr>
+</file>
+
+<file path=word/header1.xml><?xml version="1.0" encoding="utf-8"?>
+<w:hdr xmlns:m="http://schemas.openxmlformats.org/officeDocument/2006/math" xmlns:mc="http://schemas.openxmlformats.org/markup-compatibility/2006" xmlns:mo="http://schemas.microsoft.com/office/mac/office/2008/main" xmlns:mv="urn:schemas-microsoft-com:mac:vml" xmlns:o="urn:schemas-microsoft-com:office:office" xmlns:r="http://schemas.openxmlformats.org/officeDocument/2006/relationships" xmlns:v="urn:schemas-microsoft-com:vml" xmlns:w10="urn:schemas-microsoft-com:office:word" xmlns:w14="http://schemas.microsoft.com/office/word/2010/wordml" xmlns:w="http://schemas.openxmlformats.org/wordprocessingml/2006/main" xmlns:wne="http://schemas.microsoft.com/office/word/2006/wordml" xmlns:wp14="http://schemas.microsoft.com/office/word/2010/wordprocessingDrawing" xmlns:wp="http://schemas.openxmlformats.org/drawingml/2006/wordprocessingDrawing" xmlns:wpc="http://schemas.microsoft.com/office/word/2010/wordprocessingCanvas" xmlns:wpg="http://schemas.microsoft.com/office/word/2010/wordprocessingGroup" xmlns:wpi="http://schemas.microsoft.com/office/word/2010/wordprocessingInk" xmlns:wps="http://schemas.microsoft.com/office/word/2010/wordprocessingShape" mc:Ignorable="w14 wp14">
+  <w:p>
+    <w:pPr>
+      <w:pStyle w:val="Header"/>
+    </w:pPr>
+  </w:p>
+</w:hdr>
+</file>
+
+<file path=word/header2.xml><?xml version="1.0" encoding="utf-8"?>
+<w:hdr xmlns:m="http://schemas.openxmlformats.org/officeDocument/2006/math" xmlns:mc="http://schemas.openxmlformats.org/markup-compatibility/2006" xmlns:mo="http://schemas.microsoft.com/office/mac/office/2008/main" xmlns:mv="urn:schemas-microsoft-com:mac:vml" xmlns:o="urn:schemas-microsoft-com:office:office" xmlns:r="http://schemas.openxmlformats.org/officeDocument/2006/relationships" xmlns:v="urn:schemas-microsoft-com:vml" xmlns:w10="urn:schemas-microsoft-com:office:word" xmlns:w14="http://schemas.microsoft.com/office/word/2010/wordml" xmlns:w="http://schemas.openxmlformats.org/wordprocessingml/2006/main" xmlns:wne="http://schemas.microsoft.com/office/word/2006/wordml" xmlns:wp14="http://schemas.microsoft.com/office/word/2010/wordprocessingDrawing" xmlns:wp="http://schemas.openxmlformats.org/drawingml/2006/wordprocessingDrawing" xmlns:wpc="http://schemas.microsoft.com/office/word/2010/wordprocessingCanvas" xmlns:wpg="http://schemas.microsoft.com/office/word/2010/wordprocessingGroup" xmlns:wpi="http://schemas.microsoft.com/office/word/2010/wordprocessingInk" xmlns:wps="http://schemas.microsoft.com/office/word/2010/wordprocessingShape" mc:Ignorable="w14 wp14">
+  <w:p>
+    <w:pPr>
+      <w:pStyle w:val="Header"/>
+    </w:pPr>
+  </w:p>
+</w:hdr>
+</file>
+
+<file path=word/header3.xml><?xml version="1.0" encoding="utf-8"?>
+<w:hdr xmlns:m="http://schemas.openxmlformats.org/officeDocument/2006/math" xmlns:mc="http://schemas.openxmlformats.org/markup-compatibility/2006" xmlns:mo="http://schemas.microsoft.com/office/mac/office/2008/main" xmlns:mv="urn:schemas-microsoft-com:mac:vml" xmlns:o="urn:schemas-microsoft-com:office:office" xmlns:r="http://schemas.openxmlformats.org/officeDocument/2006/relationships" xmlns:v="urn:schemas-microsoft-com:vml" xmlns:w10="urn:schemas-microsoft-com:office:word" xmlns:w14="http://schemas.microsoft.com/office/word/2010/wordml" xmlns:w="http://schemas.openxmlformats.org/wordprocessingml/2006/main" xmlns:wne="http://schemas.microsoft.com/office/word/2006/wordml" xmlns:wp14="http://schemas.microsoft.com/office/word/2010/wordprocessingDrawing" xmlns:wp="http://schemas.openxmlformats.org/drawingml/2006/wordprocessingDrawing" xmlns:wpc="http://schemas.microsoft.com/office/word/2010/wordprocessingCanvas" xmlns:wpg="http://schemas.microsoft.com/office/word/2010/wordprocessingGroup" xmlns:wpi="http://schemas.microsoft.com/office/word/2010/wordprocessingInk" xmlns:wps="http://schemas.microsoft.com/office/word/2010/wordprocessingShape" mc:Ignorable="w14 wp14">
+  <w:p>
+    <w:pPr>
+      <w:pStyle w:val="Header"/>
+      <w:tabs>
+        <w:tab w:val="right" w:pos="9360"/>
+      </w:tabs>
+      <w:pBdr>
+        <w:bottom w:val="single" w:sz="4" w:space="6" w:color="C9D1D9"/>
+      </w:pBdr>
+      <w:spacing w:after="0"/>
+      <w:rPr>
+        <w:rFonts w:ascii="Calibri" w:hAnsi="Calibri"/>
+        <w:sz w:val="18"/>
+        <w:color w:val="6E7681"/>
+      </w:rPr>
+    </w:pPr>
+    <w:r>
+      <w:rPr>
+        <w:rFonts w:ascii="Calibri" w:hAnsi="Calibri"/>
+        <w:smallCaps/>
+        <w:sz w:val="18"/>
+        <w:color w:val="6E7681"/>
+        <w:spacing w:val="40"/>
+      </w:rPr>
+      <w:t>Consensus Change Standards</w:t>
+    </w:r>
+    <w:r>
+      <w:rPr>
+        <w:rFonts w:ascii="Calibri" w:hAnsi="Calibri"/>
+        <w:sz w:val="18"/>
+        <w:color w:val="6E7681"/>
+      </w:rPr>
+      <w:tab/>
+    </w:r>
+    <w:r>
+      <w:rPr>
+        <w:rFonts w:ascii="Calibri" w:hAnsi="Calibri"/>
+        <w:smallCaps/>
+        <w:sz w:val="18"/>
+        <w:color w:val="6E7681"/>
+        <w:spacing w:val="40"/>
+      </w:rPr>
+      <w:fldChar w:fldCharType="begin"/>
+    </w:r>
+    <w:r>
+      <w:rPr>
+        <w:rFonts w:ascii="Calibri" w:hAnsi="Calibri"/>
+        <w:smallCaps/>
+        <w:sz w:val="18"/>
+        <w:color w:val="6E7681"/>
+        <w:spacing w:val="40"/>
+      </w:rPr>
+      <w:instrText xml:space="preserve"> STYLEREF "Heading 1" \* MERGEFORMAT </w:instrText>
+    </w:r>
+    <w:r>
+      <w:rPr>
+        <w:rFonts w:ascii="Calibri" w:hAnsi="Calibri"/>
+        <w:smallCaps/>
+        <w:sz w:val="18"/>
+        <w:color w:val="6E7681"/>
+        <w:spacing w:val="40"/>
+      </w:rPr>
+      <w:fldChar w:fldCharType="separate"/>
+    </w:r>
+    <w:r>
+      <w:rPr>
+        <w:rFonts w:ascii="Calibri" w:hAnsi="Calibri"/>
+        <w:smallCaps/>
+        <w:sz w:val="18"/>
+        <w:color w:val="6E7681"/>
+        <w:spacing w:val="40"/>
+      </w:rPr>
+      <w:t>Section</w:t>
+    </w:r>
+    <w:r>
+      <w:rPr>
+        <w:rFonts w:ascii="Calibri" w:hAnsi="Calibri"/>
+        <w:smallCaps/>
+        <w:sz w:val="18"/>
+        <w:color w:val="6E7681"/>
+        <w:spacing w:val="40"/>
+      </w:rPr>
+      <w:fldChar w:fldCharType="end"/>
+    </w:r>
+  </w:p>
+</w:hdr>
 </file>
 
 <file path=word/numbering.xml><?xml version="1.0" encoding="utf-8"?>

</xml_diff>

<commit_message>
Fix cover positioning: anchor image to page (0,0) instead of inline
The inline image (wp:inline) was sitting on a text baseline inside its
paragraph, which added line leading at the top and pushed the bottom of
the 8.5×11" image past the page edge — white bar at top, asaffulkslaw.com
clipped at bottom.

Converted to wp:anchor with positionH/positionV relativeFrom="page" at
offset 0,0 and wrapNone. Image now sits at exact page coordinates,
8.5×11" filling edge to edge.
</commit_message>
<xml_diff>
--- a/consensus_change_standards.docx
+++ b/consensus_change_standards.docx
@@ -9,9 +9,18 @@
       </w:pPr>
       <w:r>
         <w:drawing>
-          <wp:inline xmlns:a="http://schemas.openxmlformats.org/drawingml/2006/main" xmlns:pic="http://schemas.openxmlformats.org/drawingml/2006/picture">
+          <wp:anchor xmlns:a="http://schemas.openxmlformats.org/drawingml/2006/main" xmlns:pic="http://schemas.openxmlformats.org/drawingml/2006/picture" distT="0" distB="0" distL="0" distR="0" simplePos="0" relativeHeight="251658240" behindDoc="0" locked="0" layoutInCell="1" allowOverlap="1">
+            <wp:simplePos x="0" y="0"/>
+            <wp:positionH relativeFrom="page">
+              <wp:posOffset>0</wp:posOffset>
+            </wp:positionH>
+            <wp:positionV relativeFrom="page">
+              <wp:posOffset>0</wp:posOffset>
+            </wp:positionV>
             <wp:extent cx="7772400" cy="10058400"/>
-            <wp:docPr id="3" name="Picture 3"/>
+            <wp:effectExtent l="0" t="0" r="0" b="0"/>
+            <wp:wrapNone/>
+            <wp:docPr id="3" name="Cover"/>
             <wp:cNvGraphicFramePr>
               <a:graphicFrameLocks noChangeAspect="1"/>
             </wp:cNvGraphicFramePr>
@@ -38,7 +47,7 @@
                 </pic:pic>
               </a:graphicData>
             </a:graphic>
-          </wp:inline>
+          </wp:anchor>
         </w:drawing>
       </w:r>
     </w:p>

</xml_diff>